<commit_message>
style: align colons and text in CV skills section
</commit_message>
<xml_diff>
--- a/assets/CV_Muhammad_Jepri.docx
+++ b/assets/CV_Muhammad_Jepri.docx
@@ -828,66 +828,235 @@
         <w:t>KETERAMPILAN &amp; BAHASA</w:t>
       </w:r>
     </w:p>
-    <w:p>
-      <w:pPr>
-        <w:spacing w:before="80" w:after="40"/>
-      </w:pPr>
-      <w:r>
-        <w:rPr>
-          <w:rFonts w:ascii="Calibri" w:hAnsi="Calibri"/>
-          <w:b/>
-          <w:sz w:val="20"/>
-        </w:rPr>
-        <w:t xml:space="preserve">Soft Skill: </w:t>
-      </w:r>
-      <w:r>
-        <w:rPr>
-          <w:rFonts w:ascii="Calibri" w:hAnsi="Calibri"/>
-          <w:sz w:val="20"/>
-        </w:rPr>
-        <w:t>Kerja Sama Tim, Pemecahan Masalah (Problem Solving), Kemampuan Adaptasi, Manajemen Waktu, Komunikasi Interpersonal.</w:t>
-      </w:r>
-    </w:p>
-    <w:p>
-      <w:pPr>
-        <w:spacing w:after="40"/>
-      </w:pPr>
-      <w:r>
-        <w:rPr>
-          <w:rFonts w:ascii="Calibri" w:hAnsi="Calibri"/>
-          <w:b/>
-          <w:sz w:val="20"/>
-        </w:rPr>
-        <w:t xml:space="preserve">Hard Skill: </w:t>
-      </w:r>
-      <w:r>
-        <w:rPr>
-          <w:rFonts w:ascii="Calibri" w:hAnsi="Calibri"/>
-          <w:sz w:val="20"/>
-        </w:rPr>
-        <w:t>Python, CustomTkinter, Batchfile Scripting, HTML/CSS/JavaScript, Bootstrap, Relational Database (SQL), NoSQL Database (MongoDB), Git/GitHub, System Administration.</w:t>
-      </w:r>
-    </w:p>
-    <w:p>
-      <w:pPr>
-        <w:spacing w:after="120"/>
-      </w:pPr>
-      <w:r>
-        <w:rPr>
-          <w:rFonts w:ascii="Calibri" w:hAnsi="Calibri"/>
-          <w:b/>
-          <w:sz w:val="20"/>
-        </w:rPr>
-        <w:t xml:space="preserve">Bahasa: </w:t>
-      </w:r>
-      <w:r>
-        <w:rPr>
-          <w:rFonts w:ascii="Calibri" w:hAnsi="Calibri"/>
-          <w:sz w:val="20"/>
-        </w:rPr>
-        <w:t>Indonesia (Mahir/Native), Inggris (Menengah).</w:t>
-      </w:r>
-    </w:p>
+    <w:tbl>
+      <w:tblPr>
+        <w:tblW w:type="auto" w:w="0"/>
+        <w:jc w:val="center"/>
+        <w:tblLayout w:type="fixed"/>
+        <w:tblLook w:firstColumn="1" w:firstRow="1" w:lastColumn="0" w:lastRow="0" w:noHBand="0" w:noVBand="1" w:val="04A0"/>
+      </w:tblPr>
+      <w:tblGrid>
+        <w:gridCol w:w="1440"/>
+        <w:gridCol w:w="216"/>
+        <w:gridCol w:w="8280"/>
+      </w:tblGrid>
+      <w:tr>
+        <w:tc>
+          <w:tcPr>
+            <w:tcW w:type="dxa" w:w="3312"/>
+            <w:tcMar>
+              <w:top w:w="0" w:type="dxa"/>
+              <w:left w:w="0" w:type="dxa"/>
+              <w:bottom w:w="0" w:type="dxa"/>
+              <w:right w:w="0" w:type="dxa"/>
+            </w:tcMar>
+          </w:tcPr>
+          <w:p>
+            <w:pPr>
+              <w:spacing w:before="40" w:after="40"/>
+            </w:pPr>
+            <w:r>
+              <w:rPr>
+                <w:rFonts w:ascii="Calibri" w:hAnsi="Calibri"/>
+                <w:b/>
+                <w:sz w:val="20"/>
+              </w:rPr>
+              <w:t>Soft Skill</w:t>
+            </w:r>
+          </w:p>
+        </w:tc>
+        <w:tc>
+          <w:tcPr>
+            <w:tcW w:type="dxa" w:w="3312"/>
+            <w:tcMar>
+              <w:top w:w="0" w:type="dxa"/>
+              <w:left w:w="0" w:type="dxa"/>
+              <w:bottom w:w="0" w:type="dxa"/>
+              <w:right w:w="0" w:type="dxa"/>
+            </w:tcMar>
+          </w:tcPr>
+          <w:p>
+            <w:pPr>
+              <w:spacing w:before="40" w:after="40"/>
+            </w:pPr>
+            <w:r>
+              <w:rPr>
+                <w:rFonts w:ascii="Calibri" w:hAnsi="Calibri"/>
+                <w:sz w:val="20"/>
+              </w:rPr>
+              <w:t>:</w:t>
+            </w:r>
+          </w:p>
+        </w:tc>
+        <w:tc>
+          <w:tcPr>
+            <w:tcW w:type="dxa" w:w="3312"/>
+            <w:tcMar>
+              <w:top w:w="0" w:type="dxa"/>
+              <w:left w:w="0" w:type="dxa"/>
+              <w:bottom w:w="0" w:type="dxa"/>
+              <w:right w:w="0" w:type="dxa"/>
+            </w:tcMar>
+          </w:tcPr>
+          <w:p>
+            <w:pPr>
+              <w:spacing w:before="40" w:after="40" w:line="276" w:lineRule="auto"/>
+            </w:pPr>
+            <w:r>
+              <w:rPr>
+                <w:rFonts w:ascii="Calibri" w:hAnsi="Calibri"/>
+                <w:sz w:val="20"/>
+              </w:rPr>
+              <w:t>Kerja Sama Tim, Pemecahan Masalah (Problem Solving), Kemampuan Adaptasi, Manajemen Waktu, Komunikasi Interpersonal.</w:t>
+            </w:r>
+          </w:p>
+        </w:tc>
+      </w:tr>
+      <w:tr>
+        <w:tc>
+          <w:tcPr>
+            <w:tcW w:type="dxa" w:w="3312"/>
+            <w:tcMar>
+              <w:top w:w="0" w:type="dxa"/>
+              <w:left w:w="0" w:type="dxa"/>
+              <w:bottom w:w="0" w:type="dxa"/>
+              <w:right w:w="0" w:type="dxa"/>
+            </w:tcMar>
+          </w:tcPr>
+          <w:p>
+            <w:pPr>
+              <w:spacing w:before="40" w:after="40"/>
+            </w:pPr>
+            <w:r>
+              <w:rPr>
+                <w:rFonts w:ascii="Calibri" w:hAnsi="Calibri"/>
+                <w:b/>
+                <w:sz w:val="20"/>
+              </w:rPr>
+              <w:t>Hard Skill</w:t>
+            </w:r>
+          </w:p>
+        </w:tc>
+        <w:tc>
+          <w:tcPr>
+            <w:tcW w:type="dxa" w:w="3312"/>
+            <w:tcMar>
+              <w:top w:w="0" w:type="dxa"/>
+              <w:left w:w="0" w:type="dxa"/>
+              <w:bottom w:w="0" w:type="dxa"/>
+              <w:right w:w="0" w:type="dxa"/>
+            </w:tcMar>
+          </w:tcPr>
+          <w:p>
+            <w:pPr>
+              <w:spacing w:before="40" w:after="40"/>
+            </w:pPr>
+            <w:r>
+              <w:rPr>
+                <w:rFonts w:ascii="Calibri" w:hAnsi="Calibri"/>
+                <w:sz w:val="20"/>
+              </w:rPr>
+              <w:t>:</w:t>
+            </w:r>
+          </w:p>
+        </w:tc>
+        <w:tc>
+          <w:tcPr>
+            <w:tcW w:type="dxa" w:w="3312"/>
+            <w:tcMar>
+              <w:top w:w="0" w:type="dxa"/>
+              <w:left w:w="0" w:type="dxa"/>
+              <w:bottom w:w="0" w:type="dxa"/>
+              <w:right w:w="0" w:type="dxa"/>
+            </w:tcMar>
+          </w:tcPr>
+          <w:p>
+            <w:pPr>
+              <w:spacing w:before="40" w:after="40" w:line="276" w:lineRule="auto"/>
+            </w:pPr>
+            <w:r>
+              <w:rPr>
+                <w:rFonts w:ascii="Calibri" w:hAnsi="Calibri"/>
+                <w:sz w:val="20"/>
+              </w:rPr>
+              <w:t>Python, CustomTkinter, Batchfile Scripting, HTML/CSS/JavaScript, Bootstrap, Relational Database (SQL), NoSQL Database (MongoDB), Git/GitHub, System Administration.</w:t>
+            </w:r>
+          </w:p>
+        </w:tc>
+      </w:tr>
+      <w:tr>
+        <w:tc>
+          <w:tcPr>
+            <w:tcW w:type="dxa" w:w="3312"/>
+            <w:tcMar>
+              <w:top w:w="0" w:type="dxa"/>
+              <w:left w:w="0" w:type="dxa"/>
+              <w:bottom w:w="0" w:type="dxa"/>
+              <w:right w:w="0" w:type="dxa"/>
+            </w:tcMar>
+          </w:tcPr>
+          <w:p>
+            <w:pPr>
+              <w:spacing w:before="40" w:after="40"/>
+            </w:pPr>
+            <w:r>
+              <w:rPr>
+                <w:rFonts w:ascii="Calibri" w:hAnsi="Calibri"/>
+                <w:b/>
+                <w:sz w:val="20"/>
+              </w:rPr>
+              <w:t>Bahasa</w:t>
+            </w:r>
+          </w:p>
+        </w:tc>
+        <w:tc>
+          <w:tcPr>
+            <w:tcW w:type="dxa" w:w="3312"/>
+            <w:tcMar>
+              <w:top w:w="0" w:type="dxa"/>
+              <w:left w:w="0" w:type="dxa"/>
+              <w:bottom w:w="0" w:type="dxa"/>
+              <w:right w:w="0" w:type="dxa"/>
+            </w:tcMar>
+          </w:tcPr>
+          <w:p>
+            <w:pPr>
+              <w:spacing w:before="40" w:after="40"/>
+            </w:pPr>
+            <w:r>
+              <w:rPr>
+                <w:rFonts w:ascii="Calibri" w:hAnsi="Calibri"/>
+                <w:sz w:val="20"/>
+              </w:rPr>
+              <w:t>:</w:t>
+            </w:r>
+          </w:p>
+        </w:tc>
+        <w:tc>
+          <w:tcPr>
+            <w:tcW w:type="dxa" w:w="3312"/>
+            <w:tcMar>
+              <w:top w:w="0" w:type="dxa"/>
+              <w:left w:w="0" w:type="dxa"/>
+              <w:bottom w:w="0" w:type="dxa"/>
+              <w:right w:w="0" w:type="dxa"/>
+            </w:tcMar>
+          </w:tcPr>
+          <w:p>
+            <w:pPr>
+              <w:spacing w:before="40" w:after="40" w:line="276" w:lineRule="auto"/>
+            </w:pPr>
+            <w:r>
+              <w:rPr>
+                <w:rFonts w:ascii="Calibri" w:hAnsi="Calibri"/>
+                <w:sz w:val="20"/>
+              </w:rPr>
+              <w:t>Indonesia (Mahir/Native), Inggris (Menengah).</w:t>
+            </w:r>
+          </w:p>
+        </w:tc>
+      </w:tr>
+    </w:tbl>
     <w:p>
       <w:pPr>
         <w:keepNext/>

</xml_diff>